<commit_message>
Add GEO brand fact knowledge base
</commit_message>
<xml_diff>
--- a/public/downloads/yhl-geo-brand-content-optimization-plan.docx
+++ b/public/downloads/yhl-geo-brand-content-optimization-plan.docx
@@ -418,7 +418,7 @@
           <w:color w:val="182320"/>
           <w:sz w:val="20"/>
         </w:rPr>
-        <w:t>14页主方案 · 90天执行工作簿 · 公开网站策略栏目 · 8页主案例入口</w:t>
+        <w:t>14页主方案 · 90天执行工作簿 · 品牌事实知识库 · 公开网站策略栏目 · 8页主案例入口</w:t>
       </w:r>
     </w:p>
     <w:p>
@@ -4554,7 +4554,7 @@
           <w:color w:val="182320"/>
           <w:sz w:val="46"/>
         </w:rPr>
-        <w:t>内容架构：P0先守住事实，P1再解释差异，P2建立规模</w:t>
+        <w:t>内容架构：P0守事实，知识库串证据，P1/P2再扩展</w:t>
       </w:r>
     </w:p>
     <w:p>
@@ -4570,7 +4570,7 @@
           <w:color w:val="61706C"/>
           <w:sz w:val="19"/>
         </w:rPr>
-        <w:t>现有5页MVP和FAQ继续承担首发；品牌事实与定位在第三方证据足够后拆分，避免为了“页面完整”而写出无依据定位。</w:t>
+        <w:t>现有5页MVP和FAQ继续承担首发；品牌事实知识库作为独立底座，连接事实、来源、证据、FAQ和页面。</w:t>
       </w:r>
     </w:p>
     <w:tbl>
@@ -4700,6 +4700,10 @@
                 <w:color w:val="182320"/>
                 <w:sz w:val="18"/>
               </w:rPr>
+              <w:t>品牌事实知识库v1</w:t>
+              <w:br/>
+              <w:t>公开JSON快照</w:t>
+              <w:br/>
               <w:t>品牌事实与定位MVP</w:t>
               <w:br/>
               <w:t>同名主体消歧</w:t>
@@ -5137,7 +5141,7 @@
                 <w:color w:val="182320"/>
                 <w:sz w:val="16"/>
               </w:rPr>
-              <w:t>事实等级、evidence_id、source_id、URL</w:t>
+              <w:t>fact_id、事实等级、evidence_id、source_id、URL</w:t>
             </w:r>
           </w:p>
         </w:tc>
@@ -5165,7 +5169,7 @@
                 <w:color w:val="182320"/>
                 <w:sz w:val="16"/>
               </w:rPr>
-              <w:t>把强事实连回证据</w:t>
+              <w:t>把强事实连回知识库与证据</w:t>
             </w:r>
           </w:p>
         </w:tc>
@@ -5457,7 +5461,7 @@
               <w:bottom w:w="80" w:type="dxa"/>
               <w:end w:w="120" w:type="dxa"/>
             </w:tcMar>
-            <w:shd w:fill="F1E2DC"/>
+            <w:shd w:fill="F4EBD9"/>
           </w:tcPr>
           <w:p>
             <w:pPr>
@@ -5468,10 +5472,10 @@
                 <w:rFonts w:ascii="Arial Unicode MS" w:hAnsi="Arial Unicode MS" w:eastAsia="Arial Unicode MS"/>
                 <w:b/>
                 <w:i w:val="0"/>
-                <w:color w:val="A3422F"/>
+                <w:color w:val="B68B4C"/>
                 <w:sz w:val="18"/>
               </w:rPr>
-              <w:t xml:space="preserve">拆页条件  </w:t>
+              <w:t xml:space="preserve">知识库接口  </w:t>
             </w:r>
             <w:r>
               <w:rPr>
@@ -5481,7 +5485,7 @@
                 <w:color w:val="182320"/>
                 <w:sz w:val="20"/>
               </w:rPr>
-              <w:t>品牌定位页只有在行业位置、代表性活动或差异化主张拥有明确第三方来源时才独立发布；否则继续与品牌事实页合并。</w:t>
+              <w:t>Excel知识库作为事实主库；公开JSON只输出ID、事实内容、证据等级、来源链接、更新时间、事实边界、关联问题和页面，不输出内部备注或审核意见。</w:t>
             </w:r>
           </w:p>
         </w:tc>
@@ -11194,7 +11198,7 @@
                 <w:color w:val="182320"/>
                 <w:sz w:val="16"/>
               </w:rPr>
-              <w:t>冻结品牌主体口径；完善P0五页与FAQ；补元数据、来源、边界和内链；建立发布质检</w:t>
+              <w:t>冻结品牌主体口径；建立11表品牌事实知识库与公开JSON；完善P0五页与FAQ；补元数据、来源、边界和内链；建立发布质检</w:t>
             </w:r>
           </w:p>
         </w:tc>
@@ -11222,6 +11226,8 @@
                 <w:color w:val="182320"/>
                 <w:sz w:val="16"/>
               </w:rPr>
+              <w:t>知识库+公开JSON</w:t>
+              <w:br/>
               <w:t>5页MVP+15 FAQ</w:t>
               <w:br/>
               <w:t>内容矩阵</w:t>
@@ -11256,7 +11262,9 @@
               </w:rPr>
               <w:t>30/30承接</w:t>
               <w:br/>
-              <w:t>P0字段100%完整</w:t>
+              <w:t>27信源迁移</w:t>
+              <w:br/>
+              <w:t>15FAQ映射</w:t>
             </w:r>
           </w:p>
         </w:tc>
@@ -11941,7 +11949,7 @@
                 <w:color w:val="182320"/>
                 <w:sz w:val="16"/>
               </w:rPr>
-              <w:t>口径一致、发布质检、复测和差异</w:t>
+              <w:t>口径一致、知识库治理、发布质检、复测和差异</w:t>
             </w:r>
           </w:p>
         </w:tc>
@@ -11969,7 +11977,7 @@
                 <w:color w:val="182320"/>
                 <w:sz w:val="16"/>
               </w:rPr>
-              <w:t>KPI看板/复测结果</w:t>
+              <w:t>知识库/公开JSON/KPI看板</w:t>
             </w:r>
           </w:p>
         </w:tc>
@@ -12027,7 +12035,7 @@
                 <w:color w:val="182320"/>
                 <w:sz w:val="20"/>
               </w:rPr>
-              <w:t>品牌事实与定位每季度复核；动态商业信息每月或发布前复核；标准与方法年度复核；重大活动、证书或主体变化触发即时更新。</w:t>
+              <w:t>品牌事实与定位每季度复核；知识库每月检查新增、失效和待核验事实；动态商业信息每月或发布前复核；重大活动、证书或主体变化触发即时更新。</w:t>
             </w:r>
           </w:p>
         </w:tc>
@@ -12511,7 +12519,7 @@
                 <w:color w:val="182320"/>
                 <w:sz w:val="16"/>
               </w:rPr>
-              <w:t>技术发布</w:t>
+              <w:t>知识库完整度</w:t>
             </w:r>
           </w:p>
         </w:tc>
@@ -12539,7 +12547,7 @@
                 <w:color w:val="182320"/>
                 <w:sz w:val="16"/>
               </w:rPr>
-              <w:t>无需登录、移动端可读、链接有效、robots/sitemap齐全</w:t>
+              <w:t>11表；27信源迁移；30题和15FAQ全部映射</w:t>
             </w:r>
           </w:p>
         </w:tc>
@@ -12569,7 +12577,7 @@
                 <w:color w:val="182320"/>
                 <w:sz w:val="16"/>
               </w:rPr>
-              <w:t>观察基线</w:t>
+              <w:t>硬验收</w:t>
             </w:r>
           </w:p>
         </w:tc>
@@ -12597,7 +12605,7 @@
                 <w:color w:val="182320"/>
                 <w:sz w:val="16"/>
               </w:rPr>
-              <w:t>可靠性</w:t>
+              <w:t>技术发布</w:t>
             </w:r>
           </w:p>
         </w:tc>
@@ -12625,7 +12633,7 @@
                 <w:color w:val="182320"/>
                 <w:sz w:val="16"/>
               </w:rPr>
-              <w:t>Baseline150：3.69/5</w:t>
+              <w:t>无需登录、移动端可读、链接有效、robots/sitemap齐全</w:t>
             </w:r>
           </w:p>
         </w:tc>
@@ -12683,7 +12691,7 @@
                 <w:color w:val="182320"/>
                 <w:sz w:val="16"/>
               </w:rPr>
-              <w:t>有效来源覆盖</w:t>
+              <w:t>可靠性</w:t>
             </w:r>
           </w:p>
         </w:tc>
@@ -12711,7 +12719,7 @@
                 <w:color w:val="182320"/>
                 <w:sz w:val="16"/>
               </w:rPr>
-              <w:t>Baseline150：16/150（10.7%）</w:t>
+              <w:t>Baseline150：3.69/5</w:t>
             </w:r>
           </w:p>
         </w:tc>
@@ -12769,7 +12777,7 @@
                 <w:color w:val="182320"/>
                 <w:sz w:val="16"/>
               </w:rPr>
-              <w:t>非品牌自然提及</w:t>
+              <w:t>有效来源覆盖</w:t>
             </w:r>
           </w:p>
         </w:tc>
@@ -12797,7 +12805,7 @@
                 <w:color w:val="182320"/>
                 <w:sz w:val="16"/>
               </w:rPr>
-              <w:t>UserIntent子样本：20/30（66.7%）</w:t>
+              <w:t>Baseline150：16/150（10.7%）</w:t>
             </w:r>
           </w:p>
         </w:tc>
@@ -12855,7 +12863,7 @@
                 <w:color w:val="182320"/>
                 <w:sz w:val="16"/>
               </w:rPr>
-              <w:t>确认幻觉</w:t>
+              <w:t>非品牌自然提及</w:t>
             </w:r>
           </w:p>
         </w:tc>
@@ -12863,6 +12871,92 @@
           <w:tcPr>
             <w:tcW w:type="dxa" w:w="4360"/>
             <w:shd w:fill="F1E2DC"/>
+            <w:vAlign w:val="center"/>
+            <w:tcMar>
+              <w:top w:w="80" w:type="dxa"/>
+              <w:start w:w="120" w:type="dxa"/>
+              <w:bottom w:w="80" w:type="dxa"/>
+              <w:end w:w="120" w:type="dxa"/>
+            </w:tcMar>
+          </w:tcPr>
+          <w:p>
+            <w:pPr>
+              <w:spacing w:after="20" w:line="259" w:lineRule="auto"/>
+            </w:pPr>
+            <w:r>
+              <w:rPr>
+                <w:rFonts w:ascii="Arial Unicode MS" w:hAnsi="Arial Unicode MS" w:eastAsia="Arial Unicode MS"/>
+                <w:b w:val="0"/>
+                <w:i w:val="0"/>
+                <w:color w:val="182320"/>
+                <w:sz w:val="16"/>
+              </w:rPr>
+              <w:t>UserIntent子样本：20/30（66.7%）</w:t>
+            </w:r>
+          </w:p>
+        </w:tc>
+      </w:tr>
+      <w:tr>
+        <w:tc>
+          <w:tcPr>
+            <w:tcW w:type="dxa" w:w="1500"/>
+            <w:shd w:fill="FFFDF8"/>
+            <w:vAlign w:val="center"/>
+            <w:tcMar>
+              <w:top w:w="80" w:type="dxa"/>
+              <w:start w:w="120" w:type="dxa"/>
+              <w:bottom w:w="80" w:type="dxa"/>
+              <w:end w:w="120" w:type="dxa"/>
+            </w:tcMar>
+          </w:tcPr>
+          <w:p>
+            <w:pPr>
+              <w:spacing w:after="20" w:line="259" w:lineRule="auto"/>
+            </w:pPr>
+            <w:r>
+              <w:rPr>
+                <w:rFonts w:ascii="Arial Unicode MS" w:hAnsi="Arial Unicode MS" w:eastAsia="Arial Unicode MS"/>
+                <w:b/>
+                <w:i w:val="0"/>
+                <w:color w:val="182320"/>
+                <w:sz w:val="16"/>
+              </w:rPr>
+              <w:t>观察基线</w:t>
+            </w:r>
+          </w:p>
+        </w:tc>
+        <w:tc>
+          <w:tcPr>
+            <w:tcW w:type="dxa" w:w="3500"/>
+            <w:shd w:fill="FFFDF8"/>
+            <w:vAlign w:val="center"/>
+            <w:tcMar>
+              <w:top w:w="80" w:type="dxa"/>
+              <w:start w:w="120" w:type="dxa"/>
+              <w:bottom w:w="80" w:type="dxa"/>
+              <w:end w:w="120" w:type="dxa"/>
+            </w:tcMar>
+          </w:tcPr>
+          <w:p>
+            <w:pPr>
+              <w:spacing w:after="20" w:line="259" w:lineRule="auto"/>
+            </w:pPr>
+            <w:r>
+              <w:rPr>
+                <w:rFonts w:ascii="Arial Unicode MS" w:hAnsi="Arial Unicode MS" w:eastAsia="Arial Unicode MS"/>
+                <w:b w:val="0"/>
+                <w:i w:val="0"/>
+                <w:color w:val="182320"/>
+                <w:sz w:val="16"/>
+              </w:rPr>
+              <w:t>确认幻觉</w:t>
+            </w:r>
+          </w:p>
+        </w:tc>
+        <w:tc>
+          <w:tcPr>
+            <w:tcW w:type="dxa" w:w="4360"/>
+            <w:shd w:fill="FFFDF8"/>
             <w:vAlign w:val="center"/>
             <w:tcMar>
               <w:top w:w="80" w:type="dxa"/>
@@ -13044,6 +13138,33 @@
             <w:sz w:val="17"/>
           </w:rPr>
           <w:t>https://yhl-geo-portfolio-2026.layiiii.chatgpt.site/strategy</w:t>
+        </w:r>
+      </w:hyperlink>
+    </w:p>
+    <w:p>
+      <w:pPr>
+        <w:keepNext w:val="0"/>
+        <w:spacing w:before="40" w:after="80" w:line="300" w:lineRule="auto"/>
+      </w:pPr>
+      <w:r>
+        <w:rPr>
+          <w:rFonts w:ascii="Arial Unicode MS" w:hAnsi="Arial Unicode MS" w:eastAsia="Arial Unicode MS"/>
+          <w:b/>
+          <w:i w:val="0"/>
+          <w:color w:val="61706C"/>
+          <w:sz w:val="17"/>
+        </w:rPr>
+        <w:t>查看企业知识库栏目：</w:t>
+      </w:r>
+      <w:hyperlink r:id="rId12">
+        <w:r>
+          <w:rPr>
+            <w:rFonts w:ascii="Arial Unicode MS" w:hAnsi="Arial Unicode MS" w:eastAsia="Arial Unicode MS"/>
+            <w:color w:val="0F6D65"/>
+            <w:u w:val="single"/>
+            <w:sz w:val="17"/>
+          </w:rPr>
+          <w:t>https://yhl-geo-portfolio-2026.layiiii.chatgpt.site/knowledge-base</w:t>
         </w:r>
       </w:hyperlink>
     </w:p>

</xml_diff>